<commit_message>
Auditoria adversarial: REsp 1.061.530 e certidões de fls. 204 conferidos
Co-Authored-By: Claude Opus 5.5 <noreply@anthropic.com>
Claude-Session: https://claude.ai/code/session_01TkrAgfLLUko9vjWUcVPKkP
</commit_message>
<xml_diff>
--- a/CLAUDE CODE - Auditoria_Adversarial_Manifestacao_Contraminuta_AI_2186351.docx
+++ b/CLAUDE CODE - Auditoria_Adversarial_Manifestacao_Contraminuta_AI_2186351.docx
@@ -33,7 +33,7 @@
           <w:i w:val="false"/>
           <w:iCs w:val="false"/>
         </w:rPr>
-        <w:t xml:space="preserve">Claude Code — Claude Opus 5.5 (Anthropic) | Data: 28/09/2026 | Hora: 12:06:36 | Chat: Auditoria EPE Ourinhos</w:t>
+        <w:t xml:space="preserve">Claude Code — Claude Opus 5.5 (Anthropic) | Data: 28/09/2026 | Hora: 12:06:36 (revisão às 12:30, com REsp 1.061.530 e fls. 204) | Chat: Auditoria EPE Ourinhos</w:t>
       </w:r>
     </w:p>
     <w:p>
@@ -2830,7 +2830,7 @@
                 <w:sz w:val="19"/>
                 <w:szCs w:val="19"/>
               </w:rPr>
-              <w:t xml:space="preserve">Fls. 203 e-SAJ / fls. 152 física: "Homologo (…) a conta de liquidação de fls. 134/137, sobre a qual não se manifestou o exequente." Fls. 204 e-SAJ / física: n/d: publicação no D.O.J. de 06/12/1995 e certidão de 29/12/1995: "decorreu o prazo legal, sem manifestação das partes, quanto ao r. despacho retro".</w:t>
+              <w:t xml:space="preserve">Fls. 203 e-SAJ / fls. 152 física: "Homologo (…) a conta de liquidação de fls. 134/137, sobre a qual não se manifestou o exequente." Fls. 204 e-SAJ / física: n/d (verso sem carimbo), três certidões na sequência da folha: 29/11/1995, despacho retro "enviado ao D.O.J. para publicação"; 07/12/1995, despacho retro "publicado no D.O.J. de 06/12/95"; 29/12/1995, "decorreu o prazo legal, sem manifestação das partes, quanto ao r. despacho retro" (imagem conferida com a transcrição manual enviada pelo usuário).</w:t>
             </w:r>
           </w:p>
         </w:tc>
@@ -4406,7 +4406,7 @@
                 <w:sz w:val="19"/>
                 <w:szCs w:val="19"/>
               </w:rPr>
-              <w:t xml:space="preserve">🟨</w:t>
+              <w:t xml:space="preserve">🟥</w:t>
             </w:r>
           </w:p>
         </w:tc>
@@ -4546,7 +4546,7 @@
                 <w:sz w:val="19"/>
                 <w:szCs w:val="19"/>
               </w:rPr>
-              <w:t xml:space="preserve">REsp 1.061.530/RS (2ª Seção, j. 22/10/2008), delimitação do julgamento, lido na pasta; Súmula 381/STJ.</w:t>
+              <w:t xml:space="preserve">REsp 1.061.530/RS (2ª Seção, Rel. Min. Nancy Andrighi, j. 22/10/2008, DJe 10/03/2009), ementa, "DELIMITAÇÃO DO JULGAMENTO": incidente "referente aos contratos bancários subordinados ao Código de Defesa do Consumidor (…) Exceto: cédulas de crédito rural, industrial, bancária e comercial" (conferido em 28/09/2026, arquivo enviado pelo usuário); Súmula 381/STJ.</w:t>
             </w:r>
           </w:p>
         </w:tc>
@@ -7235,7 +7235,7 @@
           <w:i w:val="false"/>
           <w:iCs w:val="false"/>
         </w:rPr>
-        <w:t xml:space="preserve">Não consegui verificar o texto oficial integral do REsp 1.061.530/RS na parte da delimitação. A leitura foi feita em sessão anterior e não repetida agora (item 11).</w:t>
+        <w:t xml:space="preserve">Nenhum. Os dois itens pendentes da primeira entrega foram conferidos em 28/09/2026: a delimitação do REsp 1.061.530/RS (item 11, agora 🟥) e as três certidões de fls. 204 e-SAJ (item 5).</w:t>
       </w:r>
     </w:p>
     <w:p>
@@ -7256,7 +7256,7 @@
           <w:i w:val="false"/>
           <w:iCs w:val="false"/>
         </w:rPr>
-        <w:t xml:space="preserve">Não verifiquei a folha física de fls. 204 e-SAJ, que não tem carimbo legível. A peça a indica como "verso da fls. 152 física".</w:t>
+        <w:t xml:space="preserve">Folha física de fls. 204 e-SAJ: física: n/d. É o verso da fls. 152 física, sem carimbo próprio. Na petição, citar "fls. 204 e-SAJ" ou "verso da fls. 152 física". Não citar o número "113" da 2ª certidão, cujo significado (página do D.O.J. ou número de relação) não está escrito.</w:t>
       </w:r>
     </w:p>
     <w:p>
@@ -8125,6 +8125,158 @@
                 <w:szCs w:val="19"/>
               </w:rPr>
               <w:t xml:space="preserve">fls. 3441 e 3442 (imagem)</w:t>
+            </w:r>
+          </w:p>
+        </w:tc>
+      </w:tr>
+      <w:tr>
+        <w:trPr>
+          <w:cantSplit/>
+          <w:tblHeader w:val="false"/>
+        </w:trPr>
+        <w:tc>
+          <w:tcPr>
+            <w:tcW w:type="dxa" w:w="4031"/>
+            <w:tcBorders>
+              <w:top w:val="single" w:color="808080" w:sz="4"/>
+              <w:left w:val="single" w:color="808080" w:sz="4"/>
+              <w:bottom w:val="single" w:color="808080" w:sz="4"/>
+              <w:right w:val="single" w:color="808080" w:sz="4"/>
+            </w:tcBorders>
+            <w:tcMar>
+              <w:top w:type="dxa" w:w="60"/>
+              <w:left w:type="dxa" w:w="90"/>
+              <w:bottom w:type="dxa" w:w="60"/>
+              <w:right w:type="dxa" w:w="90"/>
+            </w:tcMar>
+          </w:tcPr>
+          <w:p>
+            <w:pPr>
+              <w:spacing w:after="0" w:line="260"/>
+              <w:jc w:val="left"/>
+            </w:pPr>
+            <w:r>
+              <w:rPr>
+                <w:rFonts w:ascii="Times New Roman" w:cs="Times New Roman" w:eastAsia="Times New Roman" w:hAnsi="Times New Roman"/>
+                <w:b w:val="false"/>
+                <w:bCs w:val="false"/>
+                <w:i w:val="false"/>
+                <w:iCs w:val="false"/>
+                <w:sz w:val="19"/>
+                <w:szCs w:val="19"/>
+              </w:rPr>
+              <w:t xml:space="preserve">REsp 1.061.530/RS (arquivo enviado)</w:t>
+            </w:r>
+          </w:p>
+        </w:tc>
+        <w:tc>
+          <w:tcPr>
+            <w:tcW w:type="dxa" w:w="5040"/>
+            <w:tcBorders>
+              <w:top w:val="single" w:color="808080" w:sz="4"/>
+              <w:left w:val="single" w:color="808080" w:sz="4"/>
+              <w:bottom w:val="single" w:color="808080" w:sz="4"/>
+              <w:right w:val="single" w:color="808080" w:sz="4"/>
+            </w:tcBorders>
+            <w:tcMar>
+              <w:top w:type="dxa" w:w="60"/>
+              <w:left w:type="dxa" w:w="90"/>
+              <w:bottom w:type="dxa" w:w="60"/>
+              <w:right w:type="dxa" w:w="90"/>
+            </w:tcMar>
+          </w:tcPr>
+          <w:p>
+            <w:pPr>
+              <w:spacing w:after="0" w:line="260"/>
+              <w:jc w:val="left"/>
+            </w:pPr>
+            <w:r>
+              <w:rPr>
+                <w:rFonts w:ascii="Times New Roman" w:cs="Times New Roman" w:eastAsia="Times New Roman" w:hAnsi="Times New Roman"/>
+                <w:b w:val="false"/>
+                <w:bCs w:val="false"/>
+                <w:i w:val="false"/>
+                <w:iCs w:val="false"/>
+                <w:sz w:val="19"/>
+                <w:szCs w:val="19"/>
+              </w:rPr>
+              <w:t xml:space="preserve">ementa e delimitação (98 páginas; lidas as páginas da ementa e do voto sobre delimitação)</w:t>
+            </w:r>
+          </w:p>
+        </w:tc>
+      </w:tr>
+      <w:tr>
+        <w:trPr>
+          <w:cantSplit/>
+          <w:tblHeader w:val="false"/>
+        </w:trPr>
+        <w:tc>
+          <w:tcPr>
+            <w:tcW w:type="dxa" w:w="4031"/>
+            <w:tcBorders>
+              <w:top w:val="single" w:color="808080" w:sz="4"/>
+              <w:left w:val="single" w:color="808080" w:sz="4"/>
+              <w:bottom w:val="single" w:color="808080" w:sz="4"/>
+              <w:right w:val="single" w:color="808080" w:sz="4"/>
+            </w:tcBorders>
+            <w:tcMar>
+              <w:top w:type="dxa" w:w="60"/>
+              <w:left w:type="dxa" w:w="90"/>
+              <w:bottom w:type="dxa" w:w="60"/>
+              <w:right w:type="dxa" w:w="90"/>
+            </w:tcMar>
+          </w:tcPr>
+          <w:p>
+            <w:pPr>
+              <w:spacing w:after="0" w:line="260"/>
+              <w:jc w:val="left"/>
+            </w:pPr>
+            <w:r>
+              <w:rPr>
+                <w:rFonts w:ascii="Times New Roman" w:cs="Times New Roman" w:eastAsia="Times New Roman" w:hAnsi="Times New Roman"/>
+                <w:b w:val="false"/>
+                <w:bCs w:val="false"/>
+                <w:i w:val="false"/>
+                <w:iCs w:val="false"/>
+                <w:sz w:val="19"/>
+                <w:szCs w:val="19"/>
+              </w:rPr>
+              <w:t xml:space="preserve">Transcrição manual de fls. 204</w:t>
+            </w:r>
+          </w:p>
+        </w:tc>
+        <w:tc>
+          <w:tcPr>
+            <w:tcW w:type="dxa" w:w="5040"/>
+            <w:tcBorders>
+              <w:top w:val="single" w:color="808080" w:sz="4"/>
+              <w:left w:val="single" w:color="808080" w:sz="4"/>
+              <w:bottom w:val="single" w:color="808080" w:sz="4"/>
+              <w:right w:val="single" w:color="808080" w:sz="4"/>
+            </w:tcBorders>
+            <w:tcMar>
+              <w:top w:type="dxa" w:w="60"/>
+              <w:left w:type="dxa" w:w="90"/>
+              <w:bottom w:type="dxa" w:w="60"/>
+              <w:right w:type="dxa" w:w="90"/>
+            </w:tcMar>
+          </w:tcPr>
+          <w:p>
+            <w:pPr>
+              <w:spacing w:after="0" w:line="260"/>
+              <w:jc w:val="left"/>
+            </w:pPr>
+            <w:r>
+              <w:rPr>
+                <w:rFonts w:ascii="Times New Roman" w:cs="Times New Roman" w:eastAsia="Times New Roman" w:hAnsi="Times New Roman"/>
+                <w:b w:val="false"/>
+                <w:bCs w:val="false"/>
+                <w:i w:val="false"/>
+                <w:iCs w:val="false"/>
+                <w:sz w:val="19"/>
+                <w:szCs w:val="19"/>
+              </w:rPr>
+              <w:t xml:space="preserve">1 de 1</w:t>
             </w:r>
           </w:p>
         </w:tc>

</xml_diff>

<commit_message>
Verificação da manifestação v3 e correção de folhas na auditoria adversarial
Co-Authored-By: Claude Opus 5.5 <noreply@anthropic.com>
Claude-Session: https://claude.ai/code/session_01TkrAgfLLUko9vjWUcVPKkP
</commit_message>
<xml_diff>
--- a/CLAUDE CODE - Auditoria_Adversarial_Manifestacao_Contraminuta_AI_2186351.docx
+++ b/CLAUDE CODE - Auditoria_Adversarial_Manifestacao_Contraminuta_AI_2186351.docx
@@ -33,7 +33,7 @@
           <w:i w:val="false"/>
           <w:iCs w:val="false"/>
         </w:rPr>
-        <w:t xml:space="preserve">Claude Code — Claude Opus 5.5 (Anthropic) | Data: 28/09/2026 | Hora: 12:06:36 (revisão às 12:30, com REsp 1.061.530 e fls. 204) | Chat: Auditoria EPE Ourinhos</w:t>
+        <w:t xml:space="preserve">Claude Code — Claude Opus 5.5 (Anthropic) | Data: 28/09/2026 | Hora: 12:06:36 (revisões às 12:30, com REsp 1.061.530 e fls. 204, e às 15:00, com correção das folhas do AI 2236642 e do agravo nos itens 3, 6 e 16) | Chat: Auditoria EPE Ourinhos</w:t>
       </w:r>
     </w:p>
     <w:p>
@@ -2258,42 +2258,42 @@
                 <w:sz w:val="19"/>
                 <w:szCs w:val="19"/>
               </w:rPr>
-              <w:t xml:space="preserve">Acórdão, fls. 3345 e-SAJ / física: n/d: "(fls. 3.038-3.044, complementada às fls. 3.064-3.066 (…))"; fls. 3347: "tal matéria constituiu indevida inovação", referindo-se à "inclusão da verba sucumbencial"; fls. 3349: "mantida, no mais, a respeitável decisão de primeiro grau".</w:t>
-            </w:r>
-          </w:p>
-        </w:tc>
-        <w:tc>
-          <w:tcPr>
-            <w:tcW w:type="dxa" w:w="1447"/>
-            <w:tcBorders>
-              <w:top w:val="single" w:color="808080" w:sz="4"/>
-              <w:left w:val="single" w:color="808080" w:sz="4"/>
-              <w:bottom w:val="single" w:color="808080" w:sz="4"/>
-              <w:right w:val="single" w:color="808080" w:sz="4"/>
-            </w:tcBorders>
-            <w:tcMar>
-              <w:top w:type="dxa" w:w="60"/>
-              <w:left w:type="dxa" w:w="90"/>
-              <w:bottom w:type="dxa" w:w="60"/>
-              <w:right w:type="dxa" w:w="90"/>
-            </w:tcMar>
-          </w:tcPr>
-          <w:p>
-            <w:pPr>
-              <w:spacing w:after="0" w:line="260"/>
-              <w:jc w:val="left"/>
-            </w:pPr>
-            <w:r>
-              <w:rPr>
-                <w:rFonts w:ascii="Times New Roman" w:cs="Times New Roman" w:eastAsia="Times New Roman" w:hAnsi="Times New Roman"/>
-                <w:b w:val="false"/>
-                <w:bCs w:val="false"/>
-                <w:i w:val="false"/>
-                <w:iCs w:val="false"/>
-                <w:sz w:val="19"/>
-                <w:szCs w:val="19"/>
-              </w:rPr>
-              <w:t xml:space="preserve">O agravado dirá que a própria Câmara, em acórdão transitado em 04/11/2025 (fls. 3350 e-SAJ), manteve a decisão complementada por fls. 3066, inclusive o item 2.</w:t>
+              <w:t xml:space="preserve">Acórdão, fls. 3346 e-SAJ / física: n/d: "(fls. 3.038-3.044, complementada às fls. 3.064-3.066 (…))"; fls. 3348: "tal matéria constituiu indevida inovação", referindo-se à "inclusão da verba sucumbencial" (também na ementa, fls. 3345); fls. 3350: "mantida, no mais, a respeitável decisão de primeiro grau".</w:t>
+            </w:r>
+          </w:p>
+        </w:tc>
+        <w:tc>
+          <w:tcPr>
+            <w:tcW w:type="dxa" w:w="1447"/>
+            <w:tcBorders>
+              <w:top w:val="single" w:color="808080" w:sz="4"/>
+              <w:left w:val="single" w:color="808080" w:sz="4"/>
+              <w:bottom w:val="single" w:color="808080" w:sz="4"/>
+              <w:right w:val="single" w:color="808080" w:sz="4"/>
+            </w:tcBorders>
+            <w:tcMar>
+              <w:top w:type="dxa" w:w="60"/>
+              <w:left w:type="dxa" w:w="90"/>
+              <w:bottom w:type="dxa" w:w="60"/>
+              <w:right w:type="dxa" w:w="90"/>
+            </w:tcMar>
+          </w:tcPr>
+          <w:p>
+            <w:pPr>
+              <w:spacing w:after="0" w:line="260"/>
+              <w:jc w:val="left"/>
+            </w:pPr>
+            <w:r>
+              <w:rPr>
+                <w:rFonts w:ascii="Times New Roman" w:cs="Times New Roman" w:eastAsia="Times New Roman" w:hAnsi="Times New Roman"/>
+                <w:b w:val="false"/>
+                <w:bCs w:val="false"/>
+                <w:i w:val="false"/>
+                <w:iCs w:val="false"/>
+                <w:sz w:val="19"/>
+                <w:szCs w:val="19"/>
+              </w:rPr>
+              <w:t xml:space="preserve">O agravado dirá que a própria Câmara, em acórdão transitado em 04/11/2025 (fls. 3351 e-SAJ), manteve a decisão complementada por fls. 3066, inclusive o item 2.</w:t>
             </w:r>
           </w:p>
         </w:tc>
@@ -2328,7 +2328,7 @@
                 <w:sz w:val="19"/>
                 <w:szCs w:val="19"/>
               </w:rPr>
-              <w:t xml:space="preserve">Substituir por: "No AI 2236642-80.2025, interposto apenas pelo executado, esta Câmara registrou que 'a única tese ali deduzida foi o excesso de execução decorrente da suposta inclusão de encargos contratuais' e que outra matéria trazida só nos embargos de declaração 'constituiu indevida inovação' (fls. 3346/3347 e-SAJ). O item 2 de fls. 3066 favorecia o agravante daquele recurso e não foi objeto de devolução por nenhuma das partes (art. 1.013, § 1º)."</w:t>
+              <w:t xml:space="preserve">Substituir por: "No AI 2236642-80.2025, interposto apenas pelo executado, esta Câmara registrou que 'a única tese ali deduzida foi o excesso de execução decorrente da suposta inclusão de encargos contratuais' e que outra matéria trazida só nos embargos de declaração 'constituiu indevida inovação' (fls. 3347/3348 e-SAJ). O item 2 de fls. 3066 favorecia o agravante daquele recurso e não foi objeto de devolução por nenhuma das partes (art. 1.013, § 1º)."</w:t>
             </w:r>
           </w:p>
         </w:tc>
@@ -3116,7 +3116,7 @@
                 <w:sz w:val="19"/>
                 <w:szCs w:val="19"/>
               </w:rPr>
-              <w:t xml:space="preserve">Fls. 3442 e-SAJ / física: n/d (28/07/2026): base "06/05/1987 1.210.000,00"; "MULTA DE 10%"; "MULTA DE 9% R$ 609.6(…)"; "HONORÁRIOS DE 20%"; "TOTAL GERAL: R$ 9.415.99(…)". Acórdão AI 2236642, fls. 3349 e-SAJ: multa "reduzida para 1% do valor executado".</w:t>
+              <w:t xml:space="preserve">Fls. 3442 e-SAJ / física: n/d (28/07/2026): base "06/05/1987 1.210.000,00"; "MULTA DE 10%"; "MULTA DE 9% R$ 609.6(…)"; "HONORÁRIOS DE 20%"; "TOTAL GERAL: R$ 9.415.99(…)". Acórdão AI 2236642, fls. 3345 (ementa) e 3350 e-SAJ: multa "reduzida para 1% do valor executado".</w:t>
             </w:r>
           </w:p>
         </w:tc>
@@ -6046,7 +6046,7 @@
                 <w:sz w:val="19"/>
                 <w:szCs w:val="19"/>
               </w:rPr>
-              <w:t xml:space="preserve">Acrescentar uma frase remetendo ao agravo: "Quanto à incidência de juros de mora sobre o saldo consolidado e homologado, reportam-se os agravantes às razões recursais (fls. 14 do AI)."</w:t>
+              <w:t xml:space="preserve">Acrescentar uma frase remetendo ao agravo: "Quanto à incidência de juros de mora sobre o saldo consolidado e homologado, reportam-se os agravantes às razões recursais (fls. 13/15 do AI)."</w:t>
             </w:r>
           </w:p>
         </w:tc>

</xml_diff>